<commit_message>
Align memo with POC outputs
</commit_message>
<xml_diff>
--- a/artifacts/AES_Triage_POC_Memo.docx
+++ b/artifacts/AES_Triage_POC_Memo.docx
@@ -242,7 +242,7 @@
         <w:pStyle w:val="ListParagraph"/>
         <w:numPr>
           <w:ilvl w:val="0"/>
-          <w:numId w:val="4"/>
+          <w:numId w:val="6"/>
         </w:numPr>
         <w:spacing w:before="0" w:after="60"/>
         <w:rPr/>
@@ -264,7 +264,7 @@
         <w:pStyle w:val="ListParagraph"/>
         <w:numPr>
           <w:ilvl w:val="0"/>
-          <w:numId w:val="1"/>
+          <w:numId w:val="3"/>
         </w:numPr>
         <w:spacing w:before="0" w:after="60"/>
         <w:rPr/>
@@ -286,7 +286,7 @@
         <w:pStyle w:val="ListParagraph"/>
         <w:numPr>
           <w:ilvl w:val="0"/>
-          <w:numId w:val="1"/>
+          <w:numId w:val="3"/>
         </w:numPr>
         <w:spacing w:before="0" w:after="60"/>
         <w:rPr/>
@@ -308,7 +308,7 @@
         <w:pStyle w:val="ListParagraph"/>
         <w:numPr>
           <w:ilvl w:val="0"/>
-          <w:numId w:val="1"/>
+          <w:numId w:val="3"/>
         </w:numPr>
         <w:spacing w:before="0" w:after="60"/>
         <w:rPr/>
@@ -333,7 +333,7 @@
         <w:pStyle w:val="ListParagraph"/>
         <w:numPr>
           <w:ilvl w:val="0"/>
-          <w:numId w:val="1"/>
+          <w:numId w:val="3"/>
         </w:numPr>
         <w:spacing w:before="0" w:after="60"/>
         <w:rPr/>
@@ -355,7 +355,7 @@
         <w:pStyle w:val="ListParagraph"/>
         <w:numPr>
           <w:ilvl w:val="0"/>
-          <w:numId w:val="1"/>
+          <w:numId w:val="3"/>
         </w:numPr>
         <w:spacing w:before="0" w:after="60"/>
         <w:rPr/>
@@ -387,7 +387,7 @@
         <w:pStyle w:val="ListParagraph"/>
         <w:numPr>
           <w:ilvl w:val="0"/>
-          <w:numId w:val="1"/>
+          <w:numId w:val="3"/>
         </w:numPr>
         <w:spacing w:before="0" w:after="60"/>
         <w:rPr/>
@@ -455,15 +455,7 @@
       </w:r>
       <w:r>
         <w:rPr/>
-        <w:t xml:space="preserve">PR_baseline is learned only on healthy hours, daylight, available, not curtailed, plausible PR, and only from the first 30 days, so a recent fault can never teach the baseline to accept itself. </w:t>
-      </w:r>
-      <w:r>
-        <w:rPr/>
-        <w:t>I was used</w:t>
-      </w:r>
-      <w:r>
-        <w:rPr/>
-        <w:t xml:space="preserve"> a median, not a mean.</w:t>
+        <w:t>PR_baseline is learned only on healthy hours, daylight, available, not curtailed, plausible PR, and only from the first 30 days, so a recent fault can never teach the baseline to accept itself. I used a median, not a mean.</w:t>
       </w:r>
     </w:p>
     <w:p>
@@ -568,7 +560,7 @@
       </w:r>
       <w:r>
         <w:rPr/>
-        <w:t>Lost MWh × the contract-relevant price (fixed PPA vs. volatile merchant). Data-quality issues are surfaced separately with unknown $ impact rather than buried at R$0, because a blind asset is itself a priority. Resource/Weather events are non-actionable, you cannot fix the weather, so they are pulled out of the action list and collapsed into a one-line regional summary, which stops a regional cloud event from generating dozens of redundant alerts and field dispatches.</w:t>
+        <w:t>Lost MWh × the contract-relevant price (fixed PPA vs. volatile merchant). Data-quality issues are surfaced separately with unknown $ impact rather than buried at $0, because a blind asset is itself a priority. Resource/Weather events are non-actionable, you cannot fix the weather, so they are pulled out of the action list and collapsed into a one-line regional summary, which stops a regional cloud event from generating dozens of redundant alerts and field dispatches.</w:t>
       </w:r>
     </w:p>
     <w:p>
@@ -770,7 +762,7 @@
         <w:pStyle w:val="ListParagraph"/>
         <w:numPr>
           <w:ilvl w:val="0"/>
-          <w:numId w:val="1"/>
+          <w:numId w:val="3"/>
         </w:numPr>
         <w:spacing w:before="0" w:after="60"/>
         <w:rPr/>
@@ -792,7 +784,7 @@
         <w:pStyle w:val="ListParagraph"/>
         <w:numPr>
           <w:ilvl w:val="0"/>
-          <w:numId w:val="1"/>
+          <w:numId w:val="3"/>
         </w:numPr>
         <w:spacing w:before="0" w:after="60"/>
         <w:rPr/>
@@ -814,7 +806,7 @@
         <w:pStyle w:val="ListParagraph"/>
         <w:numPr>
           <w:ilvl w:val="0"/>
-          <w:numId w:val="1"/>
+          <w:numId w:val="3"/>
         </w:numPr>
         <w:spacing w:before="0" w:after="60"/>
         <w:rPr/>
@@ -836,7 +828,7 @@
         <w:pStyle w:val="ListParagraph"/>
         <w:numPr>
           <w:ilvl w:val="0"/>
-          <w:numId w:val="1"/>
+          <w:numId w:val="3"/>
         </w:numPr>
         <w:spacing w:before="0" w:after="60"/>
         <w:rPr/>
@@ -858,7 +850,7 @@
         <w:pStyle w:val="ListParagraph"/>
         <w:numPr>
           <w:ilvl w:val="0"/>
-          <w:numId w:val="1"/>
+          <w:numId w:val="3"/>
         </w:numPr>
         <w:spacing w:before="0" w:after="60"/>
         <w:rPr/>
@@ -890,14 +882,14 @@
         <w:pStyle w:val="ListParagraph"/>
         <w:numPr>
           <w:ilvl w:val="0"/>
-          <w:numId w:val="1"/>
+          <w:numId w:val="3"/>
         </w:numPr>
         <w:spacing w:before="0" w:after="60"/>
         <w:rPr/>
       </w:pPr>
       <w:r>
         <w:rPr/>
-        <w:t>Frozen/stuck telemetry (zero variance), gaps, cross-source timestamp misalignment, and, most dangerous, wrong asset-to-contract mapping that poisons the R$ ranking. Detection: dbt freshness/null/range tests, zero-variance checks, and capacity-vs-generation reconciliation.</w:t>
+        <w:t>Frozen/stuck telemetry (zero variance), gaps, cross-source timestamp misalignment, and, most dangerous, wrong asset-to-contract mapping that poisons the $ ranking. Detection: dbt freshness/null/range tests, zero-variance checks, and capacity-vs-generation reconciliation.</w:t>
       </w:r>
     </w:p>
     <w:p>
@@ -915,7 +907,7 @@
         <w:pStyle w:val="ListParagraph"/>
         <w:numPr>
           <w:ilvl w:val="0"/>
-          <w:numId w:val="1"/>
+          <w:numId w:val="3"/>
         </w:numPr>
         <w:spacing w:before="0" w:after="60"/>
         <w:rPr/>
@@ -940,7 +932,7 @@
         <w:pStyle w:val="ListParagraph"/>
         <w:numPr>
           <w:ilvl w:val="0"/>
-          <w:numId w:val="1"/>
+          <w:numId w:val="3"/>
         </w:numPr>
         <w:spacing w:before="0" w:after="60"/>
         <w:rPr/>
@@ -1001,11 +993,11 @@
       </w:tblPr>
       <w:tblGrid>
         <w:gridCol w:w="1350"/>
-        <w:gridCol w:w="1271"/>
-        <w:gridCol w:w="1728"/>
+        <w:gridCol w:w="1270"/>
+        <w:gridCol w:w="1729"/>
         <w:gridCol w:w="958"/>
-        <w:gridCol w:w="1243"/>
-        <w:gridCol w:w="1610"/>
+        <w:gridCol w:w="1242"/>
+        <w:gridCol w:w="1611"/>
         <w:gridCol w:w="1197"/>
       </w:tblGrid>
       <w:tr>
@@ -1041,7 +1033,7 @@
         </w:tc>
         <w:tc>
           <w:tcPr>
-            <w:tcW w:w="1271" w:type="dxa"/>
+            <w:tcW w:w="1270" w:type="dxa"/>
             <w:tcBorders>
               <w:top w:val="single" w:sz="2" w:space="0" w:color="CCCCCC"/>
               <w:start w:val="single" w:sz="2" w:space="0" w:color="CCCCCC"/>
@@ -1068,7 +1060,7 @@
         </w:tc>
         <w:tc>
           <w:tcPr>
-            <w:tcW w:w="1728" w:type="dxa"/>
+            <w:tcW w:w="1729" w:type="dxa"/>
             <w:tcBorders>
               <w:top w:val="single" w:sz="2" w:space="0" w:color="CCCCCC"/>
               <w:start w:val="single" w:sz="2" w:space="0" w:color="CCCCCC"/>
@@ -1122,7 +1114,7 @@
         </w:tc>
         <w:tc>
           <w:tcPr>
-            <w:tcW w:w="1243" w:type="dxa"/>
+            <w:tcW w:w="1242" w:type="dxa"/>
             <w:tcBorders>
               <w:top w:val="single" w:sz="2" w:space="0" w:color="CCCCCC"/>
               <w:start w:val="single" w:sz="2" w:space="0" w:color="CCCCCC"/>
@@ -1149,7 +1141,7 @@
         </w:tc>
         <w:tc>
           <w:tcPr>
-            <w:tcW w:w="1610" w:type="dxa"/>
+            <w:tcW w:w="1611" w:type="dxa"/>
             <w:tcBorders>
               <w:top w:val="single" w:sz="2" w:space="0" w:color="CCCCCC"/>
               <w:start w:val="single" w:sz="2" w:space="0" w:color="CCCCCC"/>
@@ -1233,7 +1225,7 @@
         </w:tc>
         <w:tc>
           <w:tcPr>
-            <w:tcW w:w="1271" w:type="dxa"/>
+            <w:tcW w:w="1270" w:type="dxa"/>
             <w:tcBorders>
               <w:top w:val="single" w:sz="2" w:space="0" w:color="CCCCCC"/>
               <w:start w:val="single" w:sz="2" w:space="0" w:color="CCCCCC"/>
@@ -1260,7 +1252,7 @@
         </w:tc>
         <w:tc>
           <w:tcPr>
-            <w:tcW w:w="1728" w:type="dxa"/>
+            <w:tcW w:w="1729" w:type="dxa"/>
             <w:tcBorders>
               <w:top w:val="single" w:sz="2" w:space="0" w:color="CCCCCC"/>
               <w:start w:val="single" w:sz="2" w:space="0" w:color="CCCCCC"/>
@@ -1314,7 +1306,7 @@
         </w:tc>
         <w:tc>
           <w:tcPr>
-            <w:tcW w:w="1243" w:type="dxa"/>
+            <w:tcW w:w="1242" w:type="dxa"/>
             <w:tcBorders>
               <w:top w:val="single" w:sz="2" w:space="0" w:color="CCCCCC"/>
               <w:start w:val="single" w:sz="2" w:space="0" w:color="CCCCCC"/>
@@ -1341,7 +1333,7 @@
         </w:tc>
         <w:tc>
           <w:tcPr>
-            <w:tcW w:w="1610" w:type="dxa"/>
+            <w:tcW w:w="1611" w:type="dxa"/>
             <w:tcBorders>
               <w:top w:val="single" w:sz="2" w:space="0" w:color="CCCCCC"/>
               <w:start w:val="single" w:sz="2" w:space="0" w:color="CCCCCC"/>
@@ -1424,7 +1416,7 @@
         </w:tc>
         <w:tc>
           <w:tcPr>
-            <w:tcW w:w="1271" w:type="dxa"/>
+            <w:tcW w:w="1270" w:type="dxa"/>
             <w:tcBorders>
               <w:top w:val="single" w:sz="2" w:space="0" w:color="CCCCCC"/>
               <w:start w:val="single" w:sz="2" w:space="0" w:color="CCCCCC"/>
@@ -1450,7 +1442,7 @@
         </w:tc>
         <w:tc>
           <w:tcPr>
-            <w:tcW w:w="1728" w:type="dxa"/>
+            <w:tcW w:w="1729" w:type="dxa"/>
             <w:tcBorders>
               <w:top w:val="single" w:sz="2" w:space="0" w:color="CCCCCC"/>
               <w:start w:val="single" w:sz="2" w:space="0" w:color="CCCCCC"/>
@@ -1502,7 +1494,7 @@
         </w:tc>
         <w:tc>
           <w:tcPr>
-            <w:tcW w:w="1243" w:type="dxa"/>
+            <w:tcW w:w="1242" w:type="dxa"/>
             <w:tcBorders>
               <w:top w:val="single" w:sz="2" w:space="0" w:color="CCCCCC"/>
               <w:start w:val="single" w:sz="2" w:space="0" w:color="CCCCCC"/>
@@ -1528,7 +1520,7 @@
         </w:tc>
         <w:tc>
           <w:tcPr>
-            <w:tcW w:w="1610" w:type="dxa"/>
+            <w:tcW w:w="1611" w:type="dxa"/>
             <w:tcBorders>
               <w:top w:val="single" w:sz="2" w:space="0" w:color="CCCCCC"/>
               <w:start w:val="single" w:sz="2" w:space="0" w:color="CCCCCC"/>
@@ -1548,7 +1540,7 @@
                 <w:sz w:val="18"/>
                 <w:szCs w:val="18"/>
               </w:rPr>
-              <w:t>71,235</w:t>
+              <w:t>22,465</w:t>
             </w:r>
           </w:p>
         </w:tc>
@@ -1609,7 +1601,7 @@
         </w:tc>
         <w:tc>
           <w:tcPr>
-            <w:tcW w:w="1271" w:type="dxa"/>
+            <w:tcW w:w="1270" w:type="dxa"/>
             <w:tcBorders>
               <w:top w:val="single" w:sz="2" w:space="0" w:color="CCCCCC"/>
               <w:start w:val="single" w:sz="2" w:space="0" w:color="CCCCCC"/>
@@ -1635,7 +1627,7 @@
         </w:tc>
         <w:tc>
           <w:tcPr>
-            <w:tcW w:w="1728" w:type="dxa"/>
+            <w:tcW w:w="1729" w:type="dxa"/>
             <w:tcBorders>
               <w:top w:val="single" w:sz="2" w:space="0" w:color="CCCCCC"/>
               <w:start w:val="single" w:sz="2" w:space="0" w:color="CCCCCC"/>
@@ -1687,7 +1679,7 @@
         </w:tc>
         <w:tc>
           <w:tcPr>
-            <w:tcW w:w="1243" w:type="dxa"/>
+            <w:tcW w:w="1242" w:type="dxa"/>
             <w:tcBorders>
               <w:top w:val="single" w:sz="2" w:space="0" w:color="CCCCCC"/>
               <w:start w:val="single" w:sz="2" w:space="0" w:color="CCCCCC"/>
@@ -1713,7 +1705,7 @@
         </w:tc>
         <w:tc>
           <w:tcPr>
-            <w:tcW w:w="1610" w:type="dxa"/>
+            <w:tcW w:w="1611" w:type="dxa"/>
             <w:tcBorders>
               <w:top w:val="single" w:sz="2" w:space="0" w:color="CCCCCC"/>
               <w:start w:val="single" w:sz="2" w:space="0" w:color="CCCCCC"/>
@@ -1733,7 +1725,7 @@
                 <w:sz w:val="18"/>
                 <w:szCs w:val="18"/>
               </w:rPr>
-              <w:t>60,780</w:t>
+              <w:t>18,685</w:t>
             </w:r>
           </w:p>
         </w:tc>
@@ -1794,7 +1786,7 @@
         </w:tc>
         <w:tc>
           <w:tcPr>
-            <w:tcW w:w="1271" w:type="dxa"/>
+            <w:tcW w:w="1270" w:type="dxa"/>
             <w:tcBorders>
               <w:top w:val="single" w:sz="2" w:space="0" w:color="CCCCCC"/>
               <w:start w:val="single" w:sz="2" w:space="0" w:color="CCCCCC"/>
@@ -1820,7 +1812,7 @@
         </w:tc>
         <w:tc>
           <w:tcPr>
-            <w:tcW w:w="1728" w:type="dxa"/>
+            <w:tcW w:w="1729" w:type="dxa"/>
             <w:tcBorders>
               <w:top w:val="single" w:sz="2" w:space="0" w:color="CCCCCC"/>
               <w:start w:val="single" w:sz="2" w:space="0" w:color="CCCCCC"/>
@@ -1872,7 +1864,7 @@
         </w:tc>
         <w:tc>
           <w:tcPr>
-            <w:tcW w:w="1243" w:type="dxa"/>
+            <w:tcW w:w="1242" w:type="dxa"/>
             <w:tcBorders>
               <w:top w:val="single" w:sz="2" w:space="0" w:color="CCCCCC"/>
               <w:start w:val="single" w:sz="2" w:space="0" w:color="CCCCCC"/>
@@ -1898,7 +1890,7 @@
         </w:tc>
         <w:tc>
           <w:tcPr>
-            <w:tcW w:w="1610" w:type="dxa"/>
+            <w:tcW w:w="1611" w:type="dxa"/>
             <w:tcBorders>
               <w:top w:val="single" w:sz="2" w:space="0" w:color="CCCCCC"/>
               <w:start w:val="single" w:sz="2" w:space="0" w:color="CCCCCC"/>
@@ -1918,7 +1910,7 @@
                 <w:sz w:val="18"/>
                 <w:szCs w:val="18"/>
               </w:rPr>
-              <w:t>24,489</w:t>
+              <w:t>7,500</w:t>
             </w:r>
           </w:p>
         </w:tc>
@@ -1979,7 +1971,7 @@
         </w:tc>
         <w:tc>
           <w:tcPr>
-            <w:tcW w:w="1271" w:type="dxa"/>
+            <w:tcW w:w="1270" w:type="dxa"/>
             <w:tcBorders>
               <w:top w:val="single" w:sz="2" w:space="0" w:color="CCCCCC"/>
               <w:start w:val="single" w:sz="2" w:space="0" w:color="CCCCCC"/>
@@ -2005,7 +1997,7 @@
         </w:tc>
         <w:tc>
           <w:tcPr>
-            <w:tcW w:w="1728" w:type="dxa"/>
+            <w:tcW w:w="1729" w:type="dxa"/>
             <w:tcBorders>
               <w:top w:val="single" w:sz="2" w:space="0" w:color="CCCCCC"/>
               <w:start w:val="single" w:sz="2" w:space="0" w:color="CCCCCC"/>
@@ -2057,7 +2049,7 @@
         </w:tc>
         <w:tc>
           <w:tcPr>
-            <w:tcW w:w="1243" w:type="dxa"/>
+            <w:tcW w:w="1242" w:type="dxa"/>
             <w:tcBorders>
               <w:top w:val="single" w:sz="2" w:space="0" w:color="CCCCCC"/>
               <w:start w:val="single" w:sz="2" w:space="0" w:color="CCCCCC"/>
@@ -2083,7 +2075,7 @@
         </w:tc>
         <w:tc>
           <w:tcPr>
-            <w:tcW w:w="1610" w:type="dxa"/>
+            <w:tcW w:w="1611" w:type="dxa"/>
             <w:tcBorders>
               <w:top w:val="single" w:sz="2" w:space="0" w:color="CCCCCC"/>
               <w:start w:val="single" w:sz="2" w:space="0" w:color="CCCCCC"/>
@@ -2103,7 +2095,7 @@
                 <w:sz w:val="18"/>
                 <w:szCs w:val="18"/>
               </w:rPr>
-              <w:t>11,258</w:t>
+              <w:t>2,775</w:t>
             </w:r>
           </w:p>
         </w:tc>
@@ -2173,7 +2165,7 @@
           <w:sz w:val="18"/>
           <w:szCs w:val="18"/>
         </w:rPr>
-        <w:t>Separately, 9 assets in the Nordeste region were attributed Resource/Weather (a shared regional event, ~735 MWh) and excluded from the action list as non-actionable — one informational line instead of nine false fault alerts.</w:t>
+        <w:t>Separately, 9 assets in the Southwest region were attributed Resource/Weather (a shared regional event, ~735 MWh) and excluded from the action list as non-actionable — one informational line instead of nine false fault alerts.</w:t>
       </w:r>
     </w:p>
     <w:p>
@@ -2341,7 +2333,7 @@
       </w:r>
       <w:r>
         <w:rPr/>
-        <w:t>SOLAR_005 (Outage): over the last two days, observed PR dropped abruptly below the asset's healthy band while irradiance stayed normal; availability fell to 52% and inverter status read 'fault'. The rule tree clears data-quality and curtailment, then attributes Outage. Estimated impact ~263 MWh ≈ R$71k. Next step: dispatch a field tech and pull inverter/string fault logs. SOLAR_027 (mixed) shows the consistency score earning its place: its flagged hours split between curtailment (day 1) and a partial outage (day 2), so it lands on Outage at only 0.55 consistency, with curtailment surfaced as a secondary cause. The Nordeste resource event shows the opposite move, nine assets dipping together is read as weather, collapsed to one non-actionable note so no crew is dispatched for the sky. The persistence requirement removed the false-positive tail entirely, the healthy assets correctly produce no flags, trading a few hours of detection latency for clean, trustworthy alerts.</w:t>
+        <w:t>SOLAR_005 (Outage): over the last two days, observed PR dropped abruptly below the asset's healthy band while irradiance stayed normal; availability fell to 52% and inverter status read 'fault'. The rule tree clears data-quality and curtailment, then attributes Outage. Estimated impact ~263 MWh ≈ $22.5k. Next step: dispatch a field tech and pull inverter/string fault logs. SOLAR_027 (mixed) shows the consistency score earning its place: its flagged hours split between curtailment (day 1) and a partial outage (day 2), so it lands on Outage at only 0.55 consistency, with curtailment surfaced as a secondary cause. The Southwest resource event shows the opposite move, nine assets dipping together is read as weather, collapsed to one non-actionable note so no crew is dispatched for the sky. The persistence requirement removed the false-positive tail entirely, the healthy assets correctly produce no flags, trading a few hours of detection latency for clean, trustworthy alerts.</w:t>
       </w:r>
     </w:p>
     <w:p>
@@ -2386,7 +2378,7 @@
         <w:pStyle w:val="ListParagraph"/>
         <w:numPr>
           <w:ilvl w:val="0"/>
-          <w:numId w:val="5"/>
+          <w:numId w:val="7"/>
         </w:numPr>
         <w:spacing w:before="0" w:after="60"/>
         <w:rPr/>
@@ -2408,7 +2400,7 @@
         <w:pStyle w:val="ListParagraph"/>
         <w:numPr>
           <w:ilvl w:val="0"/>
-          <w:numId w:val="2"/>
+          <w:numId w:val="4"/>
         </w:numPr>
         <w:spacing w:before="0" w:after="60"/>
         <w:rPr/>
@@ -2430,7 +2422,7 @@
         <w:pStyle w:val="ListParagraph"/>
         <w:numPr>
           <w:ilvl w:val="0"/>
-          <w:numId w:val="2"/>
+          <w:numId w:val="4"/>
         </w:numPr>
         <w:spacing w:before="0" w:after="60"/>
         <w:rPr/>
@@ -2462,7 +2454,7 @@
         <w:pStyle w:val="ListParagraph"/>
         <w:numPr>
           <w:ilvl w:val="0"/>
-          <w:numId w:val="1"/>
+          <w:numId w:val="3"/>
         </w:numPr>
         <w:spacing w:before="0" w:after="60"/>
         <w:rPr/>
@@ -2571,7 +2563,7 @@
         <w:pStyle w:val="ListParagraph"/>
         <w:numPr>
           <w:ilvl w:val="0"/>
-          <w:numId w:val="1"/>
+          <w:numId w:val="3"/>
         </w:numPr>
         <w:spacing w:before="0" w:after="60"/>
         <w:rPr/>
@@ -2593,7 +2585,7 @@
         <w:pStyle w:val="ListParagraph"/>
         <w:numPr>
           <w:ilvl w:val="0"/>
-          <w:numId w:val="1"/>
+          <w:numId w:val="3"/>
         </w:numPr>
         <w:spacing w:before="0" w:after="60"/>
         <w:rPr/>
@@ -2615,7 +2607,7 @@
         <w:pStyle w:val="ListParagraph"/>
         <w:numPr>
           <w:ilvl w:val="0"/>
-          <w:numId w:val="1"/>
+          <w:numId w:val="3"/>
         </w:numPr>
         <w:spacing w:before="0" w:after="60"/>
         <w:rPr/>
@@ -2839,6 +2831,7 @@
         </w:tabs>
         <w:ind w:start="1080" w:hanging="360"/>
       </w:pPr>
+      <w:rPr/>
     </w:lvl>
     <w:lvl w:ilvl="2">
       <w:start w:val="1"/>
@@ -2851,6 +2844,7 @@
         </w:tabs>
         <w:ind w:start="1440" w:hanging="360"/>
       </w:pPr>
+      <w:rPr/>
     </w:lvl>
     <w:lvl w:ilvl="3">
       <w:start w:val="1"/>
@@ -2863,6 +2857,7 @@
         </w:tabs>
         <w:ind w:start="1800" w:hanging="360"/>
       </w:pPr>
+      <w:rPr/>
     </w:lvl>
     <w:lvl w:ilvl="4">
       <w:start w:val="1"/>
@@ -2875,6 +2870,7 @@
         </w:tabs>
         <w:ind w:start="2160" w:hanging="360"/>
       </w:pPr>
+      <w:rPr/>
     </w:lvl>
     <w:lvl w:ilvl="5">
       <w:start w:val="1"/>
@@ -2887,6 +2883,7 @@
         </w:tabs>
         <w:ind w:start="2520" w:hanging="360"/>
       </w:pPr>
+      <w:rPr/>
     </w:lvl>
     <w:lvl w:ilvl="6">
       <w:start w:val="1"/>
@@ -2899,6 +2896,7 @@
         </w:tabs>
         <w:ind w:start="2880" w:hanging="360"/>
       </w:pPr>
+      <w:rPr/>
     </w:lvl>
     <w:lvl w:ilvl="7">
       <w:start w:val="1"/>
@@ -2911,6 +2909,7 @@
         </w:tabs>
         <w:ind w:start="3240" w:hanging="360"/>
       </w:pPr>
+      <w:rPr/>
     </w:lvl>
     <w:lvl w:ilvl="8">
       <w:start w:val="1"/>
@@ -2923,6 +2922,7 @@
         </w:tabs>
         <w:ind w:start="3600" w:hanging="360"/>
       </w:pPr>
+      <w:rPr/>
     </w:lvl>
   </w:abstractNum>
   <w:abstractNum w:abstractNumId="2">
@@ -2950,6 +2950,7 @@
         </w:tabs>
         <w:ind w:start="1080" w:hanging="360"/>
       </w:pPr>
+      <w:rPr/>
     </w:lvl>
     <w:lvl w:ilvl="2">
       <w:start w:val="1"/>
@@ -2962,6 +2963,7 @@
         </w:tabs>
         <w:ind w:start="1440" w:hanging="360"/>
       </w:pPr>
+      <w:rPr/>
     </w:lvl>
     <w:lvl w:ilvl="3">
       <w:start w:val="1"/>
@@ -2974,6 +2976,7 @@
         </w:tabs>
         <w:ind w:start="1800" w:hanging="360"/>
       </w:pPr>
+      <w:rPr/>
     </w:lvl>
     <w:lvl w:ilvl="4">
       <w:start w:val="1"/>
@@ -2986,6 +2989,7 @@
         </w:tabs>
         <w:ind w:start="2160" w:hanging="360"/>
       </w:pPr>
+      <w:rPr/>
     </w:lvl>
     <w:lvl w:ilvl="5">
       <w:start w:val="1"/>
@@ -2998,6 +3002,7 @@
         </w:tabs>
         <w:ind w:start="2520" w:hanging="360"/>
       </w:pPr>
+      <w:rPr/>
     </w:lvl>
     <w:lvl w:ilvl="6">
       <w:start w:val="1"/>
@@ -3010,6 +3015,7 @@
         </w:tabs>
         <w:ind w:start="2880" w:hanging="360"/>
       </w:pPr>
+      <w:rPr/>
     </w:lvl>
     <w:lvl w:ilvl="7">
       <w:start w:val="1"/>
@@ -3022,6 +3028,7 @@
         </w:tabs>
         <w:ind w:start="3240" w:hanging="360"/>
       </w:pPr>
+      <w:rPr/>
     </w:lvl>
     <w:lvl w:ilvl="8">
       <w:start w:val="1"/>
@@ -3034,9 +3041,250 @@
         </w:tabs>
         <w:ind w:start="3600" w:hanging="360"/>
       </w:pPr>
+      <w:rPr/>
     </w:lvl>
   </w:abstractNum>
   <w:abstractNum w:abstractNumId="3">
+    <w:lvl w:ilvl="0">
+      <w:start w:val="1"/>
+      <w:numFmt w:val="bullet"/>
+      <w:lvlText w:val=""/>
+      <w:lvlJc w:val="start"/>
+      <w:pPr>
+        <w:tabs>
+          <w:tab w:val="num" w:pos="0"/>
+        </w:tabs>
+        <w:ind w:start="540" w:hanging="280"/>
+      </w:pPr>
+      <w:rPr>
+        <w:rFonts w:ascii="Symbol" w:hAnsi="Symbol" w:cs="Symbol" w:hint="default"/>
+      </w:rPr>
+    </w:lvl>
+    <w:lvl w:ilvl="1">
+      <w:start w:val="1"/>
+      <w:numFmt w:val="decimal"/>
+      <w:lvlText w:val="%2."/>
+      <w:lvlJc w:val="start"/>
+      <w:pPr>
+        <w:tabs>
+          <w:tab w:val="num" w:pos="1080"/>
+        </w:tabs>
+        <w:ind w:start="1080" w:hanging="360"/>
+      </w:pPr>
+      <w:rPr/>
+    </w:lvl>
+    <w:lvl w:ilvl="2">
+      <w:start w:val="1"/>
+      <w:numFmt w:val="decimal"/>
+      <w:lvlText w:val="%3."/>
+      <w:lvlJc w:val="start"/>
+      <w:pPr>
+        <w:tabs>
+          <w:tab w:val="num" w:pos="1440"/>
+        </w:tabs>
+        <w:ind w:start="1440" w:hanging="360"/>
+      </w:pPr>
+      <w:rPr/>
+    </w:lvl>
+    <w:lvl w:ilvl="3">
+      <w:start w:val="1"/>
+      <w:numFmt w:val="decimal"/>
+      <w:lvlText w:val="%4."/>
+      <w:lvlJc w:val="start"/>
+      <w:pPr>
+        <w:tabs>
+          <w:tab w:val="num" w:pos="1800"/>
+        </w:tabs>
+        <w:ind w:start="1800" w:hanging="360"/>
+      </w:pPr>
+      <w:rPr/>
+    </w:lvl>
+    <w:lvl w:ilvl="4">
+      <w:start w:val="1"/>
+      <w:numFmt w:val="decimal"/>
+      <w:lvlText w:val="%5."/>
+      <w:lvlJc w:val="start"/>
+      <w:pPr>
+        <w:tabs>
+          <w:tab w:val="num" w:pos="2160"/>
+        </w:tabs>
+        <w:ind w:start="2160" w:hanging="360"/>
+      </w:pPr>
+      <w:rPr/>
+    </w:lvl>
+    <w:lvl w:ilvl="5">
+      <w:start w:val="1"/>
+      <w:numFmt w:val="decimal"/>
+      <w:lvlText w:val="%6."/>
+      <w:lvlJc w:val="start"/>
+      <w:pPr>
+        <w:tabs>
+          <w:tab w:val="num" w:pos="2520"/>
+        </w:tabs>
+        <w:ind w:start="2520" w:hanging="360"/>
+      </w:pPr>
+      <w:rPr/>
+    </w:lvl>
+    <w:lvl w:ilvl="6">
+      <w:start w:val="1"/>
+      <w:numFmt w:val="decimal"/>
+      <w:lvlText w:val="%7."/>
+      <w:lvlJc w:val="start"/>
+      <w:pPr>
+        <w:tabs>
+          <w:tab w:val="num" w:pos="2880"/>
+        </w:tabs>
+        <w:ind w:start="2880" w:hanging="360"/>
+      </w:pPr>
+      <w:rPr/>
+    </w:lvl>
+    <w:lvl w:ilvl="7">
+      <w:start w:val="1"/>
+      <w:numFmt w:val="decimal"/>
+      <w:lvlText w:val="%8."/>
+      <w:lvlJc w:val="start"/>
+      <w:pPr>
+        <w:tabs>
+          <w:tab w:val="num" w:pos="3240"/>
+        </w:tabs>
+        <w:ind w:start="3240" w:hanging="360"/>
+      </w:pPr>
+      <w:rPr/>
+    </w:lvl>
+    <w:lvl w:ilvl="8">
+      <w:start w:val="1"/>
+      <w:numFmt w:val="decimal"/>
+      <w:lvlText w:val="%9."/>
+      <w:lvlJc w:val="start"/>
+      <w:pPr>
+        <w:tabs>
+          <w:tab w:val="num" w:pos="3600"/>
+        </w:tabs>
+        <w:ind w:start="3600" w:hanging="360"/>
+      </w:pPr>
+      <w:rPr/>
+    </w:lvl>
+  </w:abstractNum>
+  <w:abstractNum w:abstractNumId="4">
+    <w:lvl w:ilvl="0">
+      <w:start w:val="1"/>
+      <w:numFmt w:val="decimal"/>
+      <w:lvlText w:val="%1."/>
+      <w:lvlJc w:val="start"/>
+      <w:pPr>
+        <w:tabs>
+          <w:tab w:val="num" w:pos="0"/>
+        </w:tabs>
+        <w:ind w:start="540" w:hanging="280"/>
+      </w:pPr>
+      <w:rPr/>
+    </w:lvl>
+    <w:lvl w:ilvl="1">
+      <w:start w:val="1"/>
+      <w:numFmt w:val="decimal"/>
+      <w:lvlText w:val="%2."/>
+      <w:lvlJc w:val="start"/>
+      <w:pPr>
+        <w:tabs>
+          <w:tab w:val="num" w:pos="1080"/>
+        </w:tabs>
+        <w:ind w:start="1080" w:hanging="360"/>
+      </w:pPr>
+      <w:rPr/>
+    </w:lvl>
+    <w:lvl w:ilvl="2">
+      <w:start w:val="1"/>
+      <w:numFmt w:val="decimal"/>
+      <w:lvlText w:val="%3."/>
+      <w:lvlJc w:val="start"/>
+      <w:pPr>
+        <w:tabs>
+          <w:tab w:val="num" w:pos="1440"/>
+        </w:tabs>
+        <w:ind w:start="1440" w:hanging="360"/>
+      </w:pPr>
+      <w:rPr/>
+    </w:lvl>
+    <w:lvl w:ilvl="3">
+      <w:start w:val="1"/>
+      <w:numFmt w:val="decimal"/>
+      <w:lvlText w:val="%4."/>
+      <w:lvlJc w:val="start"/>
+      <w:pPr>
+        <w:tabs>
+          <w:tab w:val="num" w:pos="1800"/>
+        </w:tabs>
+        <w:ind w:start="1800" w:hanging="360"/>
+      </w:pPr>
+      <w:rPr/>
+    </w:lvl>
+    <w:lvl w:ilvl="4">
+      <w:start w:val="1"/>
+      <w:numFmt w:val="decimal"/>
+      <w:lvlText w:val="%5."/>
+      <w:lvlJc w:val="start"/>
+      <w:pPr>
+        <w:tabs>
+          <w:tab w:val="num" w:pos="2160"/>
+        </w:tabs>
+        <w:ind w:start="2160" w:hanging="360"/>
+      </w:pPr>
+      <w:rPr/>
+    </w:lvl>
+    <w:lvl w:ilvl="5">
+      <w:start w:val="1"/>
+      <w:numFmt w:val="decimal"/>
+      <w:lvlText w:val="%6."/>
+      <w:lvlJc w:val="start"/>
+      <w:pPr>
+        <w:tabs>
+          <w:tab w:val="num" w:pos="2520"/>
+        </w:tabs>
+        <w:ind w:start="2520" w:hanging="360"/>
+      </w:pPr>
+      <w:rPr/>
+    </w:lvl>
+    <w:lvl w:ilvl="6">
+      <w:start w:val="1"/>
+      <w:numFmt w:val="decimal"/>
+      <w:lvlText w:val="%7."/>
+      <w:lvlJc w:val="start"/>
+      <w:pPr>
+        <w:tabs>
+          <w:tab w:val="num" w:pos="2880"/>
+        </w:tabs>
+        <w:ind w:start="2880" w:hanging="360"/>
+      </w:pPr>
+      <w:rPr/>
+    </w:lvl>
+    <w:lvl w:ilvl="7">
+      <w:start w:val="1"/>
+      <w:numFmt w:val="decimal"/>
+      <w:lvlText w:val="%8."/>
+      <w:lvlJc w:val="start"/>
+      <w:pPr>
+        <w:tabs>
+          <w:tab w:val="num" w:pos="3240"/>
+        </w:tabs>
+        <w:ind w:start="3240" w:hanging="360"/>
+      </w:pPr>
+      <w:rPr/>
+    </w:lvl>
+    <w:lvl w:ilvl="8">
+      <w:start w:val="1"/>
+      <w:numFmt w:val="decimal"/>
+      <w:lvlText w:val="%9."/>
+      <w:lvlJc w:val="start"/>
+      <w:pPr>
+        <w:tabs>
+          <w:tab w:val="num" w:pos="3600"/>
+        </w:tabs>
+        <w:ind w:start="3600" w:hanging="360"/>
+      </w:pPr>
+      <w:rPr/>
+    </w:lvl>
+  </w:abstractNum>
+  <w:abstractNum w:abstractNumId="5">
     <w:lvl w:ilvl="0">
       <w:start w:val="1"/>
       <w:numFmt w:val="none"/>
@@ -3165,13 +3413,19 @@
     <w:abstractNumId w:val="3"/>
   </w:num>
   <w:num w:numId="4">
-    <w:abstractNumId w:val="1"/>
+    <w:abstractNumId w:val="4"/>
+  </w:num>
+  <w:num w:numId="5">
+    <w:abstractNumId w:val="5"/>
+  </w:num>
+  <w:num w:numId="6">
+    <w:abstractNumId w:val="3"/>
     <w:lvlOverride w:ilvl="0">
       <w:startOverride w:val="1"/>
     </w:lvlOverride>
   </w:num>
-  <w:num w:numId="5">
-    <w:abstractNumId w:val="2"/>
+  <w:num w:numId="7">
+    <w:abstractNumId w:val="4"/>
     <w:lvlOverride w:ilvl="0">
       <w:startOverride w:val="1"/>
     </w:lvlOverride>
@@ -3201,6 +3455,7 @@
     <w:qFormat/>
     <w:pPr>
       <w:widowControl/>
+      <w:suppressAutoHyphens w:val="true"/>
       <w:bidi w:val="0"/>
       <w:spacing w:before="0" w:after="0"/>
       <w:jc w:val="start"/>
@@ -3297,11 +3552,18 @@
       <w:u w:val="single"/>
     </w:rPr>
   </w:style>
-  <w:style w:type="character" w:styleId="FootnoteCharacters">
-    <w:name w:val="Footnote Characters"/>
+  <w:style w:type="character" w:styleId="FootnoteCharactersuser">
+    <w:name w:val="Footnote Characters (user)"/>
     <w:uiPriority w:val="99"/>
     <w:semiHidden/>
     <w:unhideWhenUsed/>
+    <w:qFormat/>
+    <w:rPr>
+      <w:vertAlign w:val="superscript"/>
+    </w:rPr>
+  </w:style>
+  <w:style w:type="character" w:styleId="FootnoteCharacters">
+    <w:name w:val="Footnote Characters"/>
     <w:qFormat/>
     <w:rPr>
       <w:vertAlign w:val="superscript"/>
@@ -3325,11 +3587,18 @@
       <w:szCs w:val="20"/>
     </w:rPr>
   </w:style>
-  <w:style w:type="character" w:styleId="EndnoteCharacters">
-    <w:name w:val="Endnote Characters"/>
+  <w:style w:type="character" w:styleId="EndnoteCharactersuser">
+    <w:name w:val="Endnote Characters (user)"/>
     <w:uiPriority w:val="99"/>
     <w:semiHidden/>
     <w:unhideWhenUsed/>
+    <w:qFormat/>
+    <w:rPr>
+      <w:vertAlign w:val="superscript"/>
+    </w:rPr>
+  </w:style>
+  <w:style w:type="character" w:styleId="EndnoteCharacters">
+    <w:name w:val="Endnote Characters"/>
     <w:qFormat/>
     <w:rPr>
       <w:vertAlign w:val="superscript"/>
@@ -3434,6 +3703,7 @@
     <w:qFormat/>
     <w:pPr>
       <w:widowControl/>
+      <w:suppressAutoHyphens w:val="true"/>
       <w:bidi w:val="0"/>
       <w:spacing w:before="0" w:after="0"/>
       <w:jc w:val="start"/>
@@ -3454,6 +3724,7 @@
     <w:qFormat/>
     <w:pPr>
       <w:widowControl/>
+      <w:suppressAutoHyphens w:val="true"/>
       <w:bidi w:val="0"/>
       <w:spacing w:before="0" w:after="0"/>
       <w:jc w:val="start"/>

</xml_diff>